<commit_message>
Update interview notes with deployment/CI-CD decisions
</commit_message>
<xml_diff>
--- a/Docs/05-Interview-Notes.docx
+++ b/Docs/05-Interview-Notes.docx
@@ -669,6 +669,46 @@
     </w:p>
     <w:p>
       <w:pPr>
+        <w:pStyle w:val="ListParagraph"/>
+        <w:numPr>
+          <w:ilvl w:val="0"/>
+          <w:numId w:val="1"/>
+        </w:numPr>
+        <w:spacing w:after="60"/>
+      </w:pPr>
+      <w:r>
+        <w:rPr>
+          <w:b/>
+          <w:bCs/>
+        </w:rPr>
+        <w:t xml:space="preserve">Auto-migration on startup:</w:t>
+      </w:r>
+      <w:r>
+        <w:t xml:space="preserve"> The API applies any pending EF Core migrations on startup (Database.Migrate() in Program.cs) instead of a separate CI/CD migration step. Idempotent — safe on every restart — and means deployment is just "build, publish, deploy"; the database schema catches itself up automatically.</w:t>
+      </w:r>
+    </w:p>
+    <w:p>
+      <w:pPr>
+        <w:pStyle w:val="ListParagraph"/>
+        <w:numPr>
+          <w:ilvl w:val="0"/>
+          <w:numId w:val="1"/>
+        </w:numPr>
+        <w:spacing w:after="60"/>
+      </w:pPr>
+      <w:r>
+        <w:rPr>
+          <w:b/>
+          <w:bCs/>
+        </w:rPr>
+        <w:t xml:space="preserve">CI/CD split by platform, not uniform:</w:t>
+      </w:r>
+      <w:r>
+        <w:t xml:space="preserve"> Cloudflare Pages deploys the Angular app via its own native Git integration — no custom GitHub Actions workflow needed for the frontend. The API has one (.github/workflows/deploy-api.yml) since Azure App Service doesn't have an equivalent zero-config git-push-to-deploy flow for a build+publish+deploy pipeline.</w:t>
+      </w:r>
+    </w:p>
+    <w:p>
+      <w:pPr>
         <w:pStyle w:val="Heading1"/>
         <w:spacing w:after="150" w:before="300"/>
       </w:pPr>
@@ -923,6 +963,26 @@
       </w:pPr>
       <w:r>
         <w:t xml:space="preserve">A: Those columns map to SQL DATE, which has no time component. DateOnly (EF Core 8) expresses that directly instead of carrying a meaningless midnight timestamp through the whole app.</w:t>
+      </w:r>
+    </w:p>
+    <w:p>
+      <w:pPr>
+        <w:spacing w:after="40" w:before="160"/>
+      </w:pPr>
+      <w:r>
+        <w:rPr>
+          <w:b/>
+          <w:bCs/>
+        </w:rPr>
+        <w:t xml:space="preserve">Q: Walk me through how this actually deploys.</w:t>
+      </w:r>
+    </w:p>
+    <w:p>
+      <w:pPr>
+        <w:spacing w:after="100"/>
+      </w:pPr>
+      <w:r>
+        <w:t xml:space="preserve">A: Frontend: Cloudflare Pages is connected directly to the GitHub repo's native Git integration, so pushing to main rebuilds and redeploys the Angular app automatically -- no custom workflow needed there. Backend: a GitHub Actions workflow (.github/workflows/deploy-api.yml) builds, publishes, and deploys the ASP.NET Core API to Azure App Service on push, using a publish-profile secret. The database schema takes care of itself -- the app calls Database.Migrate() on startup, so there's no separate migration step or connection-string secret needed in CI just for that.</w:t>
       </w:r>
     </w:p>
     <w:p>

</xml_diff>

<commit_message>
Provision Azure resources (free tier) and finalize hosting on Azure
- Azure SQL (portfolio-sql-swapnamoy2000/PortfolioDb, free limit,
  auto-pause), App Service (portfolio-api-swapnamoy, F1), Static Web App
  (portfolio-ui-swapnamoy, Free) all live under portfolio-rg.
- Point environment.prod.ts at the real API URL; App Service CORS config
  points at the real Static Web App URL.
- Add deploy-ui.yml (Azure Static Web Apps Actions workflow) alongside the
  existing deploy-api.yml.
- Update HLD and deployment guide to reflect the finalized all-Azure choice
  (superseding the earlier Cloudflare Pages option) with real resource names.
</commit_message>
<xml_diff>
--- a/Docs/05-Interview-Notes.docx
+++ b/Docs/05-Interview-Notes.docx
@@ -701,10 +701,30 @@
           <w:b/>
           <w:bCs/>
         </w:rPr>
-        <w:t xml:space="preserve">CI/CD split by platform, not uniform:</w:t>
-      </w:r>
-      <w:r>
-        <w:t xml:space="preserve"> Cloudflare Pages deploys the Angular app via its own native Git integration — no custom GitHub Actions workflow needed for the frontend. The API has one (.github/workflows/deploy-api.yml) since Azure App Service doesn't have an equivalent zero-config git-push-to-deploy flow for a build+publish+deploy pipeline.</w:t>
+        <w:t xml:space="preserve">Hosting, finalized:</w:t>
+      </w:r>
+      <w:r>
+        <w:t xml:space="preserve"> Settled on all-Azure (Static Web Apps + App Service + SQL Database), all free tier, over the original Cloudflare Pages + Azure split — one platform, one portfolio story, GitHub Actions for both layers generated from Azure's own templates.</w:t>
+      </w:r>
+    </w:p>
+    <w:p>
+      <w:pPr>
+        <w:pStyle w:val="ListParagraph"/>
+        <w:numPr>
+          <w:ilvl w:val="0"/>
+          <w:numId w:val="1"/>
+        </w:numPr>
+        <w:spacing w:after="60"/>
+      </w:pPr>
+      <w:r>
+        <w:rPr>
+          <w:b/>
+          <w:bCs/>
+        </w:rPr>
+        <w:t xml:space="preserve">SQL free tier, specifically:</w:t>
+      </w:r>
+      <w:r>
+        <w:t xml:space="preserve"> Azure SQL's free offer requires GeneralPurpose/Serverless/Gen5 with --use-free-limit and --free-limit-exhaustion-behavior AutoPause explicitly set — AutoPause means the database just pauses instead of billing if the monthly free compute (100k vCore-seconds) is ever exhausted. Deliberately not BillForUsage, to guarantee zero surprise cost on a personal project.</w:t>
       </w:r>
     </w:p>
     <w:p>
@@ -983,6 +1003,26 @@
       </w:pPr>
       <w:r>
         <w:t xml:space="preserve">A: Frontend: Cloudflare Pages is connected directly to the GitHub repo's native Git integration, so pushing to main rebuilds and redeploys the Angular app automatically -- no custom workflow needed there. Backend: a GitHub Actions workflow (.github/workflows/deploy-api.yml) builds, publishes, and deploys the ASP.NET Core API to Azure App Service on push, using a publish-profile secret. The database schema takes care of itself -- the app calls Database.Migrate() on startup, so there's no separate migration step or connection-string secret needed in CI just for that.</w:t>
+      </w:r>
+    </w:p>
+    <w:p>
+      <w:pPr>
+        <w:spacing w:after="40" w:before="160"/>
+      </w:pPr>
+      <w:r>
+        <w:rPr>
+          <w:b/>
+          <w:bCs/>
+        </w:rPr>
+        <w:t xml:space="preserve">Q: Did deployment go smoothly, or did you hit anything real?</w:t>
+      </w:r>
+    </w:p>
+    <w:p>
+      <w:pPr>
+        <w:spacing w:after="100"/>
+      </w:pPr>
+      <w:r>
+        <w:t xml:space="preserve">A: Yes, and it's a good story: eastus and eastus2 rejected new Azure SQL servers outright and had zero F1 App Service quota on a fresh subscription -- both common restrictions on new/free Azure subscriptions. I worked through it systematically: tried a few known-good regions (centralus, eastus2, westus2, southcentralus, northeurope, westeurope, eastasia) until I found capacity, rather than guessing once and giving up. Central US had SQL and Static Web Apps capacity; East Asia had the free App Service plan. Mixed regions are fine for a low-traffic personal site -- the cross-region latency between the API and the database is negligible compared to the cost of blocking on a single region's quota.</w:t>
       </w:r>
     </w:p>
     <w:p>

</xml_diff>